<commit_message>
saved chpt 2 and 3 to desktop just to remind me to open
</commit_message>
<xml_diff>
--- a/Chapter 2 and 3 Data Working Doc.docx
+++ b/Chapter 2 and 3 Data Working Doc.docx
@@ -150,8 +150,8 @@
         </w:rPr>
       </w:r>
       <w:r>
-        <w:pict w14:anchorId="4C478100">
-          <v:rect id="Rectangle 83" o:spid="_x0000_s1039" style="width:468pt;height:.05pt;visibility:visible;mso-wrap-style:square;mso-left-percent:-10001;mso-top-percent:-10001;mso-position-horizontal:absolute;mso-position-horizontal-relative:char;mso-position-vertical:absolute;mso-position-vertical-relative:line;mso-left-percent:-10001;mso-top-percent:-10001;v-text-anchor:top" o:gfxdata="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" filled="f">
+        <w:pict w14:anchorId="0C2339B4">
+          <v:rect id="Rectangle 111" o:spid="_x0000_s1039" style="width:468pt;height:.05pt;visibility:visible;mso-wrap-style:square;mso-left-percent:-10001;mso-top-percent:-10001;mso-position-horizontal:absolute;mso-position-horizontal-relative:char;mso-position-vertical:absolute;mso-position-vertical-relative:line;mso-left-percent:-10001;mso-top-percent:-10001;v-text-anchor:top" o:gfxdata="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" filled="f">
             <o:lock v:ext="edit" aspectratio="t"/>
             <w10:anchorlock/>
           </v:rect>
@@ -383,8 +383,8 @@
         </w:rPr>
       </w:r>
       <w:r>
-        <w:pict w14:anchorId="2D98B1DB">
-          <v:rect id="Rectangle 81" o:spid="_x0000_s1038" style="width:468pt;height:.05pt;visibility:visible;mso-wrap-style:square;mso-left-percent:-10001;mso-top-percent:-10001;mso-position-horizontal:absolute;mso-position-horizontal-relative:char;mso-position-vertical:absolute;mso-position-vertical-relative:line;mso-left-percent:-10001;mso-top-percent:-10001;v-text-anchor:top" o:gfxdata="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" filled="f">
+        <w:pict w14:anchorId="45A8F0EA">
+          <v:rect id="Rectangle 109" o:spid="_x0000_s1038" style="width:468pt;height:.05pt;visibility:visible;mso-wrap-style:square;mso-left-percent:-10001;mso-top-percent:-10001;mso-position-horizontal:absolute;mso-position-horizontal-relative:char;mso-position-vertical:absolute;mso-position-vertical-relative:line;mso-left-percent:-10001;mso-top-percent:-10001;v-text-anchor:top" o:gfxdata="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" filled="f">
             <o:lock v:ext="edit" aspectratio="t"/>
             <w10:anchorlock/>
           </v:rect>
@@ -682,8 +682,8 @@
         </w:rPr>
       </w:r>
       <w:r>
-        <w:pict w14:anchorId="18D97919">
-          <v:rect id="Rectangle 79" o:spid="_x0000_s1037" style="width:468pt;height:1.1pt;visibility:visible;mso-wrap-style:square;mso-left-percent:-10001;mso-top-percent:-10001;mso-position-horizontal:absolute;mso-position-horizontal-relative:char;mso-position-vertical:absolute;mso-position-vertical-relative:line;mso-left-percent:-10001;mso-top-percent:-10001;v-text-anchor:top" o:gfxdata="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" filled="f">
+        <w:pict w14:anchorId="565E08E5">
+          <v:rect id="Rectangle 107" o:spid="_x0000_s1037" style="width:468pt;height:1.1pt;visibility:visible;mso-wrap-style:square;mso-left-percent:-10001;mso-top-percent:-10001;mso-position-horizontal:absolute;mso-position-horizontal-relative:char;mso-position-vertical:absolute;mso-position-vertical-relative:line;mso-left-percent:-10001;mso-top-percent:-10001;v-text-anchor:top" o:gfxdata="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" filled="f">
             <o:lock v:ext="edit" aspectratio="t"/>
             <w10:anchorlock/>
           </v:rect>
@@ -878,8 +878,8 @@
         </w:rPr>
       </w:r>
       <w:r>
-        <w:pict w14:anchorId="43F1D245">
-          <v:rect id="Rectangle 77" o:spid="_x0000_s1036" style="width:468pt;height:.05pt;visibility:visible;mso-wrap-style:square;mso-left-percent:-10001;mso-top-percent:-10001;mso-position-horizontal:absolute;mso-position-horizontal-relative:char;mso-position-vertical:absolute;mso-position-vertical-relative:line;mso-left-percent:-10001;mso-top-percent:-10001;v-text-anchor:top" o:gfxdata="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" filled="f">
+        <w:pict w14:anchorId="57030289">
+          <v:rect id="Rectangle 105" o:spid="_x0000_s1036" style="width:468pt;height:.05pt;visibility:visible;mso-wrap-style:square;mso-left-percent:-10001;mso-top-percent:-10001;mso-position-horizontal:absolute;mso-position-horizontal-relative:char;mso-position-vertical:absolute;mso-position-vertical-relative:line;mso-left-percent:-10001;mso-top-percent:-10001;v-text-anchor:top" o:gfxdata="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" filled="f">
             <o:lock v:ext="edit" aspectratio="t"/>
             <w10:anchorlock/>
           </v:rect>
@@ -1222,8 +1222,8 @@
         </w:rPr>
       </w:r>
       <w:r>
-        <w:pict w14:anchorId="115DCF6B">
-          <v:rect id="Rectangle 75" o:spid="_x0000_s1035" style="width:468pt;height:.05pt;visibility:visible;mso-wrap-style:square;mso-left-percent:-10001;mso-top-percent:-10001;mso-position-horizontal:absolute;mso-position-horizontal-relative:char;mso-position-vertical:absolute;mso-position-vertical-relative:line;mso-left-percent:-10001;mso-top-percent:-10001;v-text-anchor:top" o:gfxdata="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" filled="f">
+        <w:pict w14:anchorId="36432129">
+          <v:rect id="Rectangle 103" o:spid="_x0000_s1035" style="width:468pt;height:.05pt;visibility:visible;mso-wrap-style:square;mso-left-percent:-10001;mso-top-percent:-10001;mso-position-horizontal:absolute;mso-position-horizontal-relative:char;mso-position-vertical:absolute;mso-position-vertical-relative:line;mso-left-percent:-10001;mso-top-percent:-10001;v-text-anchor:top" o:gfxdata="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" filled="f">
             <o:lock v:ext="edit" aspectratio="t"/>
             <w10:anchorlock/>
           </v:rect>
@@ -1411,8 +1411,8 @@
         </w:rPr>
       </w:r>
       <w:r>
-        <w:pict w14:anchorId="164F4187">
-          <v:rect id="Rectangle 73" o:spid="_x0000_s1034" style="width:468pt;height:.05pt;visibility:visible;mso-wrap-style:square;mso-left-percent:-10001;mso-top-percent:-10001;mso-position-horizontal:absolute;mso-position-horizontal-relative:char;mso-position-vertical:absolute;mso-position-vertical-relative:line;mso-left-percent:-10001;mso-top-percent:-10001;v-text-anchor:top" o:gfxdata="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" filled="f">
+        <w:pict w14:anchorId="2DA98918">
+          <v:rect id="Rectangle 101" o:spid="_x0000_s1034" style="width:468pt;height:.05pt;visibility:visible;mso-wrap-style:square;mso-left-percent:-10001;mso-top-percent:-10001;mso-position-horizontal:absolute;mso-position-horizontal-relative:char;mso-position-vertical:absolute;mso-position-vertical-relative:line;mso-left-percent:-10001;mso-top-percent:-10001;v-text-anchor:top" o:gfxdata="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" filled="f">
             <o:lock v:ext="edit" aspectratio="t"/>
             <w10:anchorlock/>
           </v:rect>
@@ -1610,8 +1610,8 @@
         </w:rPr>
       </w:r>
       <w:r>
-        <w:pict w14:anchorId="2A0365F3">
-          <v:rect id="Rectangle 71" o:spid="_x0000_s1033" style="width:468pt;height:.05pt;visibility:visible;mso-wrap-style:square;mso-left-percent:-10001;mso-top-percent:-10001;mso-position-horizontal:absolute;mso-position-horizontal-relative:char;mso-position-vertical:absolute;mso-position-vertical-relative:line;mso-left-percent:-10001;mso-top-percent:-10001;v-text-anchor:top" o:gfxdata="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" filled="f">
+        <w:pict w14:anchorId="7A9D439D">
+          <v:rect id="Rectangle 99" o:spid="_x0000_s1033" style="width:468pt;height:.05pt;visibility:visible;mso-wrap-style:square;mso-left-percent:-10001;mso-top-percent:-10001;mso-position-horizontal:absolute;mso-position-horizontal-relative:char;mso-position-vertical:absolute;mso-position-vertical-relative:line;mso-left-percent:-10001;mso-top-percent:-10001;v-text-anchor:top" o:gfxdata="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" filled="f">
             <o:lock v:ext="edit" aspectratio="t"/>
             <w10:anchorlock/>
           </v:rect>
@@ -1738,8 +1738,8 @@
         </w:rPr>
       </w:r>
       <w:r>
-        <w:pict w14:anchorId="0DA3AA32">
-          <v:rect id="Rectangle 69" o:spid="_x0000_s1032" style="width:468pt;height:.05pt;visibility:visible;mso-wrap-style:square;mso-left-percent:-10001;mso-top-percent:-10001;mso-position-horizontal:absolute;mso-position-horizontal-relative:char;mso-position-vertical:absolute;mso-position-vertical-relative:line;mso-left-percent:-10001;mso-top-percent:-10001;v-text-anchor:top" o:gfxdata="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" filled="f">
+        <w:pict w14:anchorId="1D3B0943">
+          <v:rect id="Rectangle 97" o:spid="_x0000_s1032" style="width:468pt;height:.05pt;visibility:visible;mso-wrap-style:square;mso-left-percent:-10001;mso-top-percent:-10001;mso-position-horizontal:absolute;mso-position-horizontal-relative:char;mso-position-vertical:absolute;mso-position-vertical-relative:line;mso-left-percent:-10001;mso-top-percent:-10001;v-text-anchor:top" o:gfxdata="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" filled="f">
             <o:lock v:ext="edit" aspectratio="t"/>
             <w10:anchorlock/>
           </v:rect>
@@ -1882,8 +1882,8 @@
         </w:rPr>
       </w:r>
       <w:r>
-        <w:pict w14:anchorId="73D7A35A">
-          <v:rect id="Rectangle 67" o:spid="_x0000_s1031" style="width:468pt;height:.05pt;visibility:visible;mso-wrap-style:square;mso-left-percent:-10001;mso-top-percent:-10001;mso-position-horizontal:absolute;mso-position-horizontal-relative:char;mso-position-vertical:absolute;mso-position-vertical-relative:line;mso-left-percent:-10001;mso-top-percent:-10001;v-text-anchor:top" o:gfxdata="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" filled="f">
+        <w:pict w14:anchorId="1E90CEA2">
+          <v:rect id="Rectangle 95" o:spid="_x0000_s1031" style="width:468pt;height:.05pt;visibility:visible;mso-wrap-style:square;mso-left-percent:-10001;mso-top-percent:-10001;mso-position-horizontal:absolute;mso-position-horizontal-relative:char;mso-position-vertical:absolute;mso-position-vertical-relative:line;mso-left-percent:-10001;mso-top-percent:-10001;v-text-anchor:top" o:gfxdata="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" filled="f">
             <o:lock v:ext="edit" aspectratio="t"/>
             <w10:anchorlock/>
           </v:rect>
@@ -2102,8 +2102,8 @@
         </w:rPr>
       </w:r>
       <w:r>
-        <w:pict w14:anchorId="1809E915">
-          <v:rect id="Rectangle 65" o:spid="_x0000_s1030" style="width:468pt;height:1.1pt;visibility:visible;mso-wrap-style:square;mso-left-percent:-10001;mso-top-percent:-10001;mso-position-horizontal:absolute;mso-position-horizontal-relative:char;mso-position-vertical:absolute;mso-position-vertical-relative:line;mso-left-percent:-10001;mso-top-percent:-10001;v-text-anchor:top" o:gfxdata="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" filled="f">
+        <w:pict w14:anchorId="5F3726C8">
+          <v:rect id="Rectangle 93" o:spid="_x0000_s1030" style="width:468pt;height:1.1pt;visibility:visible;mso-wrap-style:square;mso-left-percent:-10001;mso-top-percent:-10001;mso-position-horizontal:absolute;mso-position-horizontal-relative:char;mso-position-vertical:absolute;mso-position-vertical-relative:line;mso-left-percent:-10001;mso-top-percent:-10001;v-text-anchor:top" o:gfxdata="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" filled="f">
             <o:lock v:ext="edit" aspectratio="t"/>
             <w10:anchorlock/>
           </v:rect>
@@ -2235,8 +2235,8 @@
         </w:rPr>
       </w:r>
       <w:r>
-        <w:pict w14:anchorId="6F44D85B">
-          <v:rect id="Rectangle 63" o:spid="_x0000_s1029" style="width:468pt;height:.05pt;visibility:visible;mso-wrap-style:square;mso-left-percent:-10001;mso-top-percent:-10001;mso-position-horizontal:absolute;mso-position-horizontal-relative:char;mso-position-vertical:absolute;mso-position-vertical-relative:line;mso-left-percent:-10001;mso-top-percent:-10001;v-text-anchor:top" o:gfxdata="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" filled="f">
+        <w:pict w14:anchorId="183AC087">
+          <v:rect id="Rectangle 91" o:spid="_x0000_s1029" style="width:468pt;height:.05pt;visibility:visible;mso-wrap-style:square;mso-left-percent:-10001;mso-top-percent:-10001;mso-position-horizontal:absolute;mso-position-horizontal-relative:char;mso-position-vertical:absolute;mso-position-vertical-relative:line;mso-left-percent:-10001;mso-top-percent:-10001;v-text-anchor:top" o:gfxdata="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" filled="f">
             <o:lock v:ext="edit" aspectratio="t"/>
             <w10:anchorlock/>
           </v:rect>
@@ -2368,8 +2368,8 @@
         </w:rPr>
       </w:r>
       <w:r>
-        <w:pict w14:anchorId="7D78DD8A">
-          <v:rect id="Rectangle 61" o:spid="_x0000_s1028" style="width:468pt;height:.05pt;visibility:visible;mso-wrap-style:square;mso-left-percent:-10001;mso-top-percent:-10001;mso-position-horizontal:absolute;mso-position-horizontal-relative:char;mso-position-vertical:absolute;mso-position-vertical-relative:line;mso-left-percent:-10001;mso-top-percent:-10001;v-text-anchor:top" o:gfxdata="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" filled="f">
+        <w:pict w14:anchorId="54E87EB4">
+          <v:rect id="Rectangle 89" o:spid="_x0000_s1028" style="width:468pt;height:.05pt;visibility:visible;mso-wrap-style:square;mso-left-percent:-10001;mso-top-percent:-10001;mso-position-horizontal:absolute;mso-position-horizontal-relative:char;mso-position-vertical:absolute;mso-position-vertical-relative:line;mso-left-percent:-10001;mso-top-percent:-10001;v-text-anchor:top" o:gfxdata="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" filled="f">
             <o:lock v:ext="edit" aspectratio="t"/>
             <w10:anchorlock/>
           </v:rect>
@@ -2449,8 +2449,8 @@
         </w:rPr>
       </w:r>
       <w:r>
-        <w:pict w14:anchorId="602541B8">
-          <v:rect id="Rectangle 59" o:spid="_x0000_s1027" style="width:468pt;height:.05pt;visibility:visible;mso-wrap-style:square;mso-left-percent:-10001;mso-top-percent:-10001;mso-position-horizontal:absolute;mso-position-horizontal-relative:char;mso-position-vertical:absolute;mso-position-vertical-relative:line;mso-left-percent:-10001;mso-top-percent:-10001;v-text-anchor:top" o:gfxdata="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" filled="f">
+        <w:pict w14:anchorId="1B96146F">
+          <v:rect id="Rectangle 87" o:spid="_x0000_s1027" style="width:468pt;height:.05pt;visibility:visible;mso-wrap-style:square;mso-left-percent:-10001;mso-top-percent:-10001;mso-position-horizontal:absolute;mso-position-horizontal-relative:char;mso-position-vertical:absolute;mso-position-vertical-relative:line;mso-left-percent:-10001;mso-top-percent:-10001;v-text-anchor:top" o:gfxdata="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" filled="f">
             <o:lock v:ext="edit" aspectratio="t"/>
             <w10:anchorlock/>
           </v:rect>
@@ -2532,8 +2532,8 @@
         </w:rPr>
       </w:r>
       <w:r>
-        <w:pict w14:anchorId="66DB641D">
-          <v:rect id="Rectangle 57" o:spid="_x0000_s1026" style="width:468pt;height:1.1pt;visibility:visible;mso-wrap-style:square;mso-left-percent:-10001;mso-top-percent:-10001;mso-position-horizontal:absolute;mso-position-horizontal-relative:char;mso-position-vertical:absolute;mso-position-vertical-relative:line;mso-left-percent:-10001;mso-top-percent:-10001;v-text-anchor:top" o:gfxdata="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" filled="f">
+        <w:pict w14:anchorId="5A243439">
+          <v:rect id="Rectangle 85" o:spid="_x0000_s1026" style="width:468pt;height:1.1pt;visibility:visible;mso-wrap-style:square;mso-left-percent:-10001;mso-top-percent:-10001;mso-position-horizontal:absolute;mso-position-horizontal-relative:char;mso-position-vertical:absolute;mso-position-vertical-relative:line;mso-left-percent:-10001;mso-top-percent:-10001;v-text-anchor:top" o:gfxdata="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" filled="f">
             <o:lock v:ext="edit" aspectratio="t"/>
             <w10:anchorlock/>
           </v:rect>
@@ -7044,6 +7044,201 @@
         <w:spacing w:after="0" w:line="240" w:lineRule="auto"/>
         <w:rPr>
           <w:rFonts w:ascii="Aptos" w:eastAsia="Times New Roman" w:hAnsi="Aptos" w:cs="Calibri"/>
+          <w:kern w:val="0"/>
+          <w14:ligatures w14:val="none"/>
+        </w:rPr>
+      </w:pPr>
+      <w:r>
+        <w:rPr>
+          <w:rFonts w:ascii="Aptos" w:eastAsia="Times New Roman" w:hAnsi="Aptos" w:cs="Calibri"/>
+          <w:kern w:val="0"/>
+          <w14:ligatures w14:val="none"/>
+        </w:rPr>
+        <w:t xml:space="preserve">“indictable offense” includes all crimes for which a term of imprisonment may be authorized but not petty offenses, while “petty offenses . . . are not crimes within the meaning of the Constitution of this State.” N.J. Stat. § 2C:1-4(b).1  </w:t>
+      </w:r>
+    </w:p>
+    <w:p>
+      <w:pPr>
+        <w:spacing w:after="0" w:line="240" w:lineRule="auto"/>
+        <w:rPr>
+          <w:rFonts w:ascii="Aptos" w:eastAsia="Times New Roman" w:hAnsi="Aptos" w:cs="Calibri"/>
+          <w:kern w:val="0"/>
+          <w14:ligatures w14:val="none"/>
+        </w:rPr>
+      </w:pPr>
+    </w:p>
+    <w:p>
+      <w:pPr>
+        <w:spacing w:after="0" w:line="240" w:lineRule="auto"/>
+        <w:rPr>
+          <w:rFonts w:ascii="Aptos" w:eastAsia="Times New Roman" w:hAnsi="Aptos" w:cs="Calibri"/>
+          <w:kern w:val="0"/>
+          <w14:ligatures w14:val="none"/>
+        </w:rPr>
+      </w:pPr>
+      <w:hyperlink r:id="rId12" w:history="1">
+        <w:r>
+          <w:rPr>
+            <w:rStyle w:val="Hyperlink"/>
+            <w:rFonts w:ascii="Aptos" w:eastAsia="Times New Roman" w:hAnsi="Aptos" w:cs="Calibri"/>
+            <w:kern w:val="0"/>
+            <w14:ligatures w14:val="none"/>
+          </w:rPr>
+          <w:t>https://www.njcourts.gov/sites/default/files/attorneys/attorney-resources/manualsentencinglaw.pdf</w:t>
+        </w:r>
+      </w:hyperlink>
+    </w:p>
+    <w:p>
+      <w:pPr>
+        <w:spacing w:after="0" w:line="240" w:lineRule="auto"/>
+        <w:rPr>
+          <w:rFonts w:ascii="Aptos" w:eastAsia="Times New Roman" w:hAnsi="Aptos" w:cs="Calibri"/>
+          <w:kern w:val="0"/>
+          <w14:ligatures w14:val="none"/>
+        </w:rPr>
+      </w:pPr>
+    </w:p>
+    <w:p>
+      <w:pPr>
+        <w:spacing w:after="0" w:line="240" w:lineRule="auto"/>
+        <w:rPr>
+          <w:rFonts w:ascii="Aptos" w:eastAsia="Times New Roman" w:hAnsi="Aptos" w:cs="Calibri"/>
+          <w:kern w:val="0"/>
+          <w14:ligatures w14:val="none"/>
+        </w:rPr>
+      </w:pPr>
+    </w:p>
+    <w:p>
+      <w:pPr>
+        <w:numPr>
+          <w:ilvl w:val="0"/>
+          <w:numId w:val="1"/>
+        </w:numPr>
+        <w:spacing w:after="0" w:line="240" w:lineRule="auto"/>
+        <w:textAlignment w:val="center"/>
+        <w:rPr>
+          <w:rFonts w:ascii="Calibri" w:eastAsia="Times New Roman" w:hAnsi="Calibri" w:cs="Calibri"/>
+          <w:kern w:val="0"/>
+          <w:sz w:val="22"/>
+          <w:szCs w:val="22"/>
+          <w14:ligatures w14:val="none"/>
+        </w:rPr>
+      </w:pPr>
+      <w:r>
+        <w:rPr>
+          <w:rFonts w:ascii="Aptos" w:eastAsia="Times New Roman" w:hAnsi="Aptos" w:cs="Calibri"/>
+          <w:kern w:val="0"/>
+          <w14:ligatures w14:val="none"/>
+        </w:rPr>
+        <w:lastRenderedPageBreak/>
+        <w:t xml:space="preserve"> (except persons convicted of crime involving dishonesty or higher degree of crime while holding office)</w:t>
+      </w:r>
+    </w:p>
+    <w:p>
+      <w:pPr>
+        <w:numPr>
+          <w:ilvl w:val="1"/>
+          <w:numId w:val="1"/>
+        </w:numPr>
+        <w:spacing w:after="0" w:line="240" w:lineRule="auto"/>
+        <w:textAlignment w:val="center"/>
+        <w:rPr>
+          <w:rFonts w:ascii="Calibri" w:eastAsia="Times New Roman" w:hAnsi="Calibri" w:cs="Calibri"/>
+          <w:kern w:val="0"/>
+          <w:sz w:val="22"/>
+          <w:szCs w:val="22"/>
+          <w14:ligatures w14:val="none"/>
+        </w:rPr>
+      </w:pPr>
+      <w:r>
+        <w:rPr>
+          <w:rFonts w:ascii="Aptos" w:eastAsia="Times New Roman" w:hAnsi="Aptos" w:cs="Calibri"/>
+          <w:kern w:val="0"/>
+          <w14:ligatures w14:val="none"/>
+        </w:rPr>
+        <w:t>Records</w:t>
+      </w:r>
+    </w:p>
+    <w:p>
+      <w:pPr>
+        <w:numPr>
+          <w:ilvl w:val="2"/>
+          <w:numId w:val="1"/>
+        </w:numPr>
+        <w:spacing w:after="0" w:line="240" w:lineRule="auto"/>
+        <w:textAlignment w:val="center"/>
+        <w:rPr>
+          <w:rFonts w:ascii="Calibri" w:eastAsia="Times New Roman" w:hAnsi="Calibri" w:cs="Calibri"/>
+          <w:kern w:val="0"/>
+          <w:sz w:val="22"/>
+          <w:szCs w:val="22"/>
+          <w14:ligatures w14:val="none"/>
+        </w:rPr>
+      </w:pPr>
+      <w:r>
+        <w:rPr>
+          <w:rFonts w:ascii="Aptos" w:eastAsia="Times New Roman" w:hAnsi="Aptos" w:cs="Calibri"/>
+          <w:kern w:val="0"/>
+          <w14:ligatures w14:val="none"/>
+        </w:rPr>
+        <w:t>May not show birth year &amp; gender on all records</w:t>
+      </w:r>
+    </w:p>
+    <w:p>
+      <w:pPr>
+        <w:numPr>
+          <w:ilvl w:val="2"/>
+          <w:numId w:val="1"/>
+        </w:numPr>
+        <w:spacing w:after="0" w:line="240" w:lineRule="auto"/>
+        <w:textAlignment w:val="center"/>
+        <w:rPr>
+          <w:rFonts w:ascii="Calibri" w:eastAsia="Times New Roman" w:hAnsi="Calibri" w:cs="Calibri"/>
+          <w:kern w:val="0"/>
+          <w:sz w:val="22"/>
+          <w:szCs w:val="22"/>
+          <w14:ligatures w14:val="none"/>
+        </w:rPr>
+      </w:pPr>
+      <w:r>
+        <w:rPr>
+          <w:rFonts w:ascii="Aptos" w:eastAsia="Times New Roman" w:hAnsi="Aptos" w:cs="Calibri"/>
+          <w:kern w:val="0"/>
+          <w14:ligatures w14:val="none"/>
+        </w:rPr>
+        <w:t>Does show guilt</w:t>
+      </w:r>
+    </w:p>
+    <w:p>
+      <w:pPr>
+        <w:numPr>
+          <w:ilvl w:val="1"/>
+          <w:numId w:val="1"/>
+        </w:numPr>
+        <w:spacing w:after="0" w:line="240" w:lineRule="auto"/>
+        <w:textAlignment w:val="center"/>
+        <w:rPr>
+          <w:rFonts w:ascii="Calibri" w:eastAsia="Times New Roman" w:hAnsi="Calibri" w:cs="Calibri"/>
+          <w:kern w:val="0"/>
+          <w:sz w:val="22"/>
+          <w:szCs w:val="22"/>
+          <w14:ligatures w14:val="none"/>
+        </w:rPr>
+      </w:pPr>
+      <w:r>
+        <w:rPr>
+          <w:rFonts w:ascii="Aptos" w:eastAsia="Times New Roman" w:hAnsi="Aptos" w:cs="Calibri"/>
+          <w:kern w:val="0"/>
+          <w14:ligatures w14:val="none"/>
+        </w:rPr>
+        <w:t>Recently restored jury eligibility</w:t>
+      </w:r>
+    </w:p>
+    <w:p>
+      <w:pPr>
+        <w:spacing w:after="0" w:line="240" w:lineRule="auto"/>
+        <w:rPr>
+          <w:rFonts w:ascii="Aptos" w:eastAsia="Times New Roman" w:hAnsi="Aptos" w:cs="Calibri"/>
           <w:b/>
           <w:bCs/>
           <w:kern w:val="0"/>
@@ -7056,28 +7251,62 @@
         <w:spacing w:after="0" w:line="240" w:lineRule="auto"/>
         <w:rPr>
           <w:rFonts w:ascii="Aptos" w:eastAsia="Times New Roman" w:hAnsi="Aptos" w:cs="Calibri"/>
+          <w:kern w:val="0"/>
+          <w14:ligatures w14:val="none"/>
+        </w:rPr>
+      </w:pPr>
+      <w:r>
+        <w:rPr>
+          <w:rFonts w:ascii="Aptos" w:eastAsia="Times New Roman" w:hAnsi="Aptos" w:cs="Calibri"/>
           <w:b/>
           <w:bCs/>
           <w:kern w:val="0"/>
           <w14:ligatures w14:val="none"/>
         </w:rPr>
-      </w:pPr>
-    </w:p>
-    <w:p>
-      <w:pPr>
-        <w:spacing w:after="0" w:line="240" w:lineRule="auto"/>
-        <w:rPr>
-          <w:rFonts w:ascii="Aptos" w:eastAsia="Times New Roman" w:hAnsi="Aptos" w:cs="Calibri"/>
-          <w:kern w:val="0"/>
-          <w14:ligatures w14:val="none"/>
-        </w:rPr>
-      </w:pPr>
-    </w:p>
-    <w:p>
-      <w:pPr>
-        <w:numPr>
-          <w:ilvl w:val="0"/>
-          <w:numId w:val="1"/>
+        <w:t>Only lost until sentence completed or limited waiting period</w:t>
+      </w:r>
+    </w:p>
+    <w:p>
+      <w:pPr>
+        <w:spacing w:after="0" w:line="240" w:lineRule="auto"/>
+        <w:rPr>
+          <w:rFonts w:ascii="Aptos" w:eastAsia="Times New Roman" w:hAnsi="Aptos" w:cs="Calibri"/>
+          <w:kern w:val="0"/>
+          <w14:ligatures w14:val="none"/>
+        </w:rPr>
+      </w:pPr>
+      <w:r>
+        <w:rPr>
+          <w:rFonts w:ascii="Aptos" w:eastAsia="Times New Roman" w:hAnsi="Aptos" w:cs="Calibri"/>
+          <w:kern w:val="0"/>
+          <w14:ligatures w14:val="none"/>
+        </w:rPr>
+        <w:t> </w:t>
+      </w:r>
+    </w:p>
+    <w:p>
+      <w:pPr>
+        <w:spacing w:after="0" w:line="240" w:lineRule="auto"/>
+        <w:rPr>
+          <w:rFonts w:ascii="Aptos" w:eastAsia="Times New Roman" w:hAnsi="Aptos" w:cs="Calibri"/>
+          <w:kern w:val="0"/>
+          <w14:ligatures w14:val="none"/>
+        </w:rPr>
+      </w:pPr>
+      <w:r>
+        <w:rPr>
+          <w:rFonts w:ascii="Aptos" w:eastAsia="Times New Roman" w:hAnsi="Aptos" w:cs="Calibri"/>
+          <w:kern w:val="0"/>
+          <w14:ligatures w14:val="none"/>
+        </w:rPr>
+        <w:t>South Dakota</w:t>
+      </w:r>
+    </w:p>
+    <w:p>
+      <w:pPr>
+        <w:numPr>
+          <w:ilvl w:val="0"/>
+          <w:numId w:val="2"/>
         </w:numPr>
         <w:spacing w:after="0" w:line="240" w:lineRule="auto"/>
         <w:textAlignment w:val="center"/>
@@ -7095,14 +7324,14 @@
           <w:kern w:val="0"/>
           <w14:ligatures w14:val="none"/>
         </w:rPr>
-        <w:t xml:space="preserve"> (except persons convicted of crime involving dishonesty or higher degree of crime while holding office)</w:t>
+        <w:t>PARS - central online case search</w:t>
       </w:r>
     </w:p>
     <w:p>
       <w:pPr>
         <w:numPr>
           <w:ilvl w:val="1"/>
-          <w:numId w:val="1"/>
+          <w:numId w:val="2"/>
         </w:numPr>
         <w:spacing w:after="0" w:line="240" w:lineRule="auto"/>
         <w:textAlignment w:val="center"/>
@@ -7120,14 +7349,14 @@
           <w:kern w:val="0"/>
           <w14:ligatures w14:val="none"/>
         </w:rPr>
-        <w:t>Records</w:t>
-      </w:r>
-    </w:p>
-    <w:p>
-      <w:pPr>
-        <w:numPr>
-          <w:ilvl w:val="2"/>
-          <w:numId w:val="1"/>
+        <w:t>Needs name and DOB</w:t>
+      </w:r>
+    </w:p>
+    <w:p>
+      <w:pPr>
+        <w:numPr>
+          <w:ilvl w:val="1"/>
+          <w:numId w:val="2"/>
         </w:numPr>
         <w:spacing w:after="0" w:line="240" w:lineRule="auto"/>
         <w:textAlignment w:val="center"/>
@@ -7145,14 +7374,14 @@
           <w:kern w:val="0"/>
           <w14:ligatures w14:val="none"/>
         </w:rPr>
-        <w:t>May not show birth year &amp; gender on all records</w:t>
-      </w:r>
-    </w:p>
-    <w:p>
-      <w:pPr>
-        <w:numPr>
-          <w:ilvl w:val="2"/>
-          <w:numId w:val="1"/>
+        <w:t>$20 per search</w:t>
+      </w:r>
+    </w:p>
+    <w:p>
+      <w:pPr>
+        <w:numPr>
+          <w:ilvl w:val="1"/>
+          <w:numId w:val="2"/>
         </w:numPr>
         <w:spacing w:after="0" w:line="240" w:lineRule="auto"/>
         <w:textAlignment w:val="center"/>
@@ -7170,14 +7399,14 @@
           <w:kern w:val="0"/>
           <w14:ligatures w14:val="none"/>
         </w:rPr>
-        <w:t>Does show guilt</w:t>
+        <w:t>Can request multiple in one go via UJSPARSsupport@ujs.state.sd.us</w:t>
       </w:r>
     </w:p>
     <w:p>
       <w:pPr>
         <w:numPr>
           <w:ilvl w:val="1"/>
-          <w:numId w:val="1"/>
+          <w:numId w:val="2"/>
         </w:numPr>
         <w:spacing w:after="0" w:line="240" w:lineRule="auto"/>
         <w:textAlignment w:val="center"/>
@@ -7195,75 +7424,7 @@
           <w:kern w:val="0"/>
           <w14:ligatures w14:val="none"/>
         </w:rPr>
-        <w:t>Recently restored jury eligibility</w:t>
-      </w:r>
-    </w:p>
-    <w:p>
-      <w:pPr>
-        <w:spacing w:after="0" w:line="240" w:lineRule="auto"/>
-        <w:rPr>
-          <w:rFonts w:ascii="Aptos" w:eastAsia="Times New Roman" w:hAnsi="Aptos" w:cs="Calibri"/>
-          <w:b/>
-          <w:bCs/>
-          <w:kern w:val="0"/>
-          <w14:ligatures w14:val="none"/>
-        </w:rPr>
-      </w:pPr>
-    </w:p>
-    <w:p>
-      <w:pPr>
-        <w:spacing w:after="0" w:line="240" w:lineRule="auto"/>
-        <w:rPr>
-          <w:rFonts w:ascii="Aptos" w:eastAsia="Times New Roman" w:hAnsi="Aptos" w:cs="Calibri"/>
-          <w:kern w:val="0"/>
-          <w14:ligatures w14:val="none"/>
-        </w:rPr>
-      </w:pPr>
-      <w:r>
-        <w:rPr>
-          <w:rFonts w:ascii="Aptos" w:eastAsia="Times New Roman" w:hAnsi="Aptos" w:cs="Calibri"/>
-          <w:b/>
-          <w:bCs/>
-          <w:kern w:val="0"/>
-          <w14:ligatures w14:val="none"/>
-        </w:rPr>
-        <w:t>Only lost until sentence completed or limited waiting period</w:t>
-      </w:r>
-    </w:p>
-    <w:p>
-      <w:pPr>
-        <w:spacing w:after="0" w:line="240" w:lineRule="auto"/>
-        <w:rPr>
-          <w:rFonts w:ascii="Aptos" w:eastAsia="Times New Roman" w:hAnsi="Aptos" w:cs="Calibri"/>
-          <w:kern w:val="0"/>
-          <w14:ligatures w14:val="none"/>
-        </w:rPr>
-      </w:pPr>
-      <w:r>
-        <w:rPr>
-          <w:rFonts w:ascii="Aptos" w:eastAsia="Times New Roman" w:hAnsi="Aptos" w:cs="Calibri"/>
-          <w:kern w:val="0"/>
-          <w14:ligatures w14:val="none"/>
-        </w:rPr>
-        <w:t> </w:t>
-      </w:r>
-    </w:p>
-    <w:p>
-      <w:pPr>
-        <w:spacing w:after="0" w:line="240" w:lineRule="auto"/>
-        <w:rPr>
-          <w:rFonts w:ascii="Aptos" w:eastAsia="Times New Roman" w:hAnsi="Aptos" w:cs="Calibri"/>
-          <w:kern w:val="0"/>
-          <w14:ligatures w14:val="none"/>
-        </w:rPr>
-      </w:pPr>
-      <w:r>
-        <w:rPr>
-          <w:rFonts w:ascii="Aptos" w:eastAsia="Times New Roman" w:hAnsi="Aptos" w:cs="Calibri"/>
-          <w:kern w:val="0"/>
-          <w14:ligatures w14:val="none"/>
-        </w:rPr>
-        <w:t>South Dakota</w:t>
+        <w:t>Only goes to 1989</w:t>
       </w:r>
     </w:p>
     <w:p>
@@ -7288,7 +7449,7 @@
           <w:kern w:val="0"/>
           <w14:ligatures w14:val="none"/>
         </w:rPr>
-        <w:t>PARS - central online case search</w:t>
+        <w:t>ECourts - </w:t>
       </w:r>
     </w:p>
     <w:p>
@@ -7313,13 +7474,13 @@
           <w:kern w:val="0"/>
           <w14:ligatures w14:val="none"/>
         </w:rPr>
-        <w:t>Needs name and DOB</w:t>
-      </w:r>
-    </w:p>
-    <w:p>
-      <w:pPr>
-        <w:numPr>
-          <w:ilvl w:val="1"/>
+        <w:t>Case summaries/docket info, might need to register</w:t>
+      </w:r>
+    </w:p>
+    <w:p>
+      <w:pPr>
+        <w:numPr>
+          <w:ilvl w:val="0"/>
           <w:numId w:val="2"/>
         </w:numPr>
         <w:spacing w:after="0" w:line="240" w:lineRule="auto"/>
@@ -7338,13 +7499,13 @@
           <w:kern w:val="0"/>
           <w14:ligatures w14:val="none"/>
         </w:rPr>
-        <w:t>$20 per search</w:t>
-      </w:r>
-    </w:p>
-    <w:p>
-      <w:pPr>
-        <w:numPr>
-          <w:ilvl w:val="1"/>
+        <w:t>Can look up records in person for free at courthouses (7) </w:t>
+      </w:r>
+    </w:p>
+    <w:p>
+      <w:pPr>
+        <w:numPr>
+          <w:ilvl w:val="0"/>
           <w:numId w:val="2"/>
         </w:numPr>
         <w:spacing w:after="0" w:line="240" w:lineRule="auto"/>
@@ -7357,132 +7518,7 @@
           <w14:ligatures w14:val="none"/>
         </w:rPr>
       </w:pPr>
-      <w:r>
-        <w:rPr>
-          <w:rFonts w:ascii="Aptos" w:eastAsia="Times New Roman" w:hAnsi="Aptos" w:cs="Calibri"/>
-          <w:kern w:val="0"/>
-          <w14:ligatures w14:val="none"/>
-        </w:rPr>
-        <w:t>Can request multiple in one go via UJSPARSsupport@ujs.state.sd.us</w:t>
-      </w:r>
-    </w:p>
-    <w:p>
-      <w:pPr>
-        <w:numPr>
-          <w:ilvl w:val="1"/>
-          <w:numId w:val="2"/>
-        </w:numPr>
-        <w:spacing w:after="0" w:line="240" w:lineRule="auto"/>
-        <w:textAlignment w:val="center"/>
-        <w:rPr>
-          <w:rFonts w:ascii="Calibri" w:eastAsia="Times New Roman" w:hAnsi="Calibri" w:cs="Calibri"/>
-          <w:kern w:val="0"/>
-          <w:sz w:val="22"/>
-          <w:szCs w:val="22"/>
-          <w14:ligatures w14:val="none"/>
-        </w:rPr>
-      </w:pPr>
-      <w:r>
-        <w:rPr>
-          <w:rFonts w:ascii="Aptos" w:eastAsia="Times New Roman" w:hAnsi="Aptos" w:cs="Calibri"/>
-          <w:kern w:val="0"/>
-          <w14:ligatures w14:val="none"/>
-        </w:rPr>
-        <w:t>Only goes to 1989</w:t>
-      </w:r>
-    </w:p>
-    <w:p>
-      <w:pPr>
-        <w:numPr>
-          <w:ilvl w:val="0"/>
-          <w:numId w:val="2"/>
-        </w:numPr>
-        <w:spacing w:after="0" w:line="240" w:lineRule="auto"/>
-        <w:textAlignment w:val="center"/>
-        <w:rPr>
-          <w:rFonts w:ascii="Calibri" w:eastAsia="Times New Roman" w:hAnsi="Calibri" w:cs="Calibri"/>
-          <w:kern w:val="0"/>
-          <w:sz w:val="22"/>
-          <w:szCs w:val="22"/>
-          <w14:ligatures w14:val="none"/>
-        </w:rPr>
-      </w:pPr>
-      <w:r>
-        <w:rPr>
-          <w:rFonts w:ascii="Aptos" w:eastAsia="Times New Roman" w:hAnsi="Aptos" w:cs="Calibri"/>
-          <w:kern w:val="0"/>
-          <w14:ligatures w14:val="none"/>
-        </w:rPr>
-        <w:t>ECourts - </w:t>
-      </w:r>
-    </w:p>
-    <w:p>
-      <w:pPr>
-        <w:numPr>
-          <w:ilvl w:val="1"/>
-          <w:numId w:val="2"/>
-        </w:numPr>
-        <w:spacing w:after="0" w:line="240" w:lineRule="auto"/>
-        <w:textAlignment w:val="center"/>
-        <w:rPr>
-          <w:rFonts w:ascii="Calibri" w:eastAsia="Times New Roman" w:hAnsi="Calibri" w:cs="Calibri"/>
-          <w:kern w:val="0"/>
-          <w:sz w:val="22"/>
-          <w:szCs w:val="22"/>
-          <w14:ligatures w14:val="none"/>
-        </w:rPr>
-      </w:pPr>
-      <w:r>
-        <w:rPr>
-          <w:rFonts w:ascii="Aptos" w:eastAsia="Times New Roman" w:hAnsi="Aptos" w:cs="Calibri"/>
-          <w:kern w:val="0"/>
-          <w14:ligatures w14:val="none"/>
-        </w:rPr>
-        <w:t>Case summaries/docket info, might need to register</w:t>
-      </w:r>
-    </w:p>
-    <w:p>
-      <w:pPr>
-        <w:numPr>
-          <w:ilvl w:val="0"/>
-          <w:numId w:val="2"/>
-        </w:numPr>
-        <w:spacing w:after="0" w:line="240" w:lineRule="auto"/>
-        <w:textAlignment w:val="center"/>
-        <w:rPr>
-          <w:rFonts w:ascii="Calibri" w:eastAsia="Times New Roman" w:hAnsi="Calibri" w:cs="Calibri"/>
-          <w:kern w:val="0"/>
-          <w:sz w:val="22"/>
-          <w:szCs w:val="22"/>
-          <w14:ligatures w14:val="none"/>
-        </w:rPr>
-      </w:pPr>
-      <w:r>
-        <w:rPr>
-          <w:rFonts w:ascii="Aptos" w:eastAsia="Times New Roman" w:hAnsi="Aptos" w:cs="Calibri"/>
-          <w:kern w:val="0"/>
-          <w14:ligatures w14:val="none"/>
-        </w:rPr>
-        <w:t>Can look up records in person for free at courthouses (7) </w:t>
-      </w:r>
-    </w:p>
-    <w:p>
-      <w:pPr>
-        <w:numPr>
-          <w:ilvl w:val="0"/>
-          <w:numId w:val="2"/>
-        </w:numPr>
-        <w:spacing w:after="0" w:line="240" w:lineRule="auto"/>
-        <w:textAlignment w:val="center"/>
-        <w:rPr>
-          <w:rFonts w:ascii="Calibri" w:eastAsia="Times New Roman" w:hAnsi="Calibri" w:cs="Calibri"/>
-          <w:kern w:val="0"/>
-          <w:sz w:val="22"/>
-          <w:szCs w:val="22"/>
-          <w14:ligatures w14:val="none"/>
-        </w:rPr>
-      </w:pPr>
-      <w:hyperlink r:id="rId12" w:history="1">
+      <w:hyperlink r:id="rId13" w:history="1">
         <w:r>
           <w:rPr>
             <w:rFonts w:ascii="Aptos" w:eastAsia="Times New Roman" w:hAnsi="Aptos" w:cs="Calibri"/>
@@ -8070,6 +8106,7 @@
           <w:kern w:val="0"/>
           <w14:ligatures w14:val="none"/>
         </w:rPr>
+        <w:lastRenderedPageBreak/>
         <w:t xml:space="preserve">If you want </w:t>
       </w:r>
       <w:r>
@@ -8246,7 +8283,6 @@
           <w:kern w:val="0"/>
           <w14:ligatures w14:val="none"/>
         </w:rPr>
-        <w:lastRenderedPageBreak/>
         <w:t xml:space="preserve">What would be at what court? </w:t>
       </w:r>
     </w:p>
@@ -8929,6 +8965,7 @@
           <w:kern w:val="0"/>
           <w14:ligatures w14:val="none"/>
         </w:rPr>
+        <w:lastRenderedPageBreak/>
         <w:t>Connecticut</w:t>
       </w:r>
     </w:p>
@@ -9083,7 +9120,6 @@
           <w:kern w:val="0"/>
           <w14:ligatures w14:val="none"/>
         </w:rPr>
-        <w:lastRenderedPageBreak/>
         <w:t>To confirm, try calling 1-800-252-8683 (voter questions)</w:t>
       </w:r>
     </w:p>
@@ -9675,6 +9711,7 @@
         </w:rPr>
       </w:pPr>
       <w:r>
+        <w:lastRenderedPageBreak/>
         <w:t xml:space="preserve">note on coding: </w:t>
       </w:r>
       <w:r>
@@ -10111,6 +10148,7 @@
           <w:kern w:val="0"/>
           <w14:ligatures w14:val="none"/>
         </w:rPr>
+        <w:lastRenderedPageBreak/>
         <w:t>Is expungable automatic in any category? (Y/N)</w:t>
       </w:r>
     </w:p>
@@ -10225,7 +10263,6 @@
           <w:kern w:val="0"/>
           <w14:ligatures w14:val="none"/>
         </w:rPr>
-        <w:lastRenderedPageBreak/>
         <w:t>Pardon required for expungement FE</w:t>
       </w:r>
     </w:p>
@@ -10487,6 +10524,7 @@
           <w:sz w:val="28"/>
           <w:szCs w:val="28"/>
         </w:rPr>
+        <w:lastRenderedPageBreak/>
         <w:t>state CH repository searchable?</w:t>
       </w:r>
     </w:p>
@@ -10577,7 +10615,6 @@
           <w:sz w:val="28"/>
           <w:szCs w:val="28"/>
         </w:rPr>
-        <w:lastRenderedPageBreak/>
         <w:t>Former inmate records searchable?</w:t>
       </w:r>
     </w:p>
@@ -10812,6 +10849,7 @@
           <w:sz w:val="28"/>
           <w:szCs w:val="28"/>
         </w:rPr>
+        <w:lastRenderedPageBreak/>
         <w:t>If yes, start date</w:t>
       </w:r>
     </w:p>
@@ -10902,7 +10940,6 @@
           <w:sz w:val="28"/>
           <w:szCs w:val="28"/>
         </w:rPr>
-        <w:lastRenderedPageBreak/>
         <w:t>follow up</w:t>
       </w:r>
     </w:p>

</xml_diff>